<commit_message>
Refresh Vast facts and add an opening for contacts without an F1 background
Co-Authored-By: Claude Opus 5.5 <noreply@anthropic.com>
Claude-Session: https://claude.ai/code/session_011Vvxd2V3zerAfjn84yXuuv
</commit_message>
<xml_diff>
--- a/call-scripts/Vast-F1-Discovery-Call-Script.docx
+++ b/call-scripts/Vast-F1-Discovery-Call-Script.docx
@@ -394,7 +394,7 @@
           <w:sz w:val="25"/>
           <w:szCs w:val="25"/>
         </w:rPr>
-        <w:t xml:space="preserve">Who Vast is (verified 11 October 2026; re-verify on call day)</w:t>
+        <w:t xml:space="preserve">Who Vast is (verified 20 October 2026; re-verify on call day)</w:t>
       </w:r>
     </w:p>
     <w:p>
@@ -443,7 +443,7 @@
         <w:t xml:space="preserve">Haven-1</w:t>
       </w:r>
       <w:r>
-        <w:t xml:space="preserve">, intended to be the world's first commercial space station. A single module, launched on a SpaceX Falcon 9, with crews visiting on SpaceX Dragon capsules. Launch timing has moved: public reporting through late 2025 said 2026, and more recent reporting says 2027. Treat the date carefully and attribute it; never state a launch date as fact.</w:t>
+        <w:t xml:space="preserve">, intended to be the world's first commercial space station. A single module, launched on a SpaceX Falcon 9, with crews visiting on SpaceX Dragon capsules. Launch timing has moved: the target through late 2025 was May 2026; the latest reporting (Payload Space) puts it no earlier than the first quarter of 2027, with crewed visits to follow once the station is proven safe. Treat the date carefully and attribute it; never state a launch date as fact.</w:t>
       </w:r>
     </w:p>
     <w:p>
@@ -608,7 +608,7 @@
         <w:t xml:space="preserve">Names check:</w:t>
       </w:r>
       <w:r>
-        <w:t xml:space="preserve"> SPORTFIVE citations in this script (Mercedes and Ferrari exclusivity history, RUCKUS at Haas, Airwallex at McLaren) were verified in September 2026 checks; Vast facts were checked on 11 October 2026. Re-verify on call day.</w:t>
+        <w:t xml:space="preserve"> SPORTFIVE citations in this script (Mercedes and Ferrari exclusivity history, RUCKUS at Haas, Airwallex at McLaren) were verified in September 2026 checks; Vast facts were checked on 11 October 2026 and refreshed on 20 October 2026; no NASA Phase 2 award for the ISS successor was found as of that date. Re-verify on call day.</w:t>
       </w:r>
     </w:p>
     <w:p>
@@ -826,6 +826,104 @@
     </w:p>
     <w:p>
       <w:pPr>
+        <w:spacing w:after="80" w:before="80"/>
+      </w:pPr>
+      <w:r>
+        <w:rPr>
+          <w:b/>
+          <w:bCs/>
+        </w:rPr>
+        <w:t xml:space="preserve">Alternative opening, if your contact has no F1 background:</w:t>
+      </w:r>
+    </w:p>
+    <w:p>
+      <w:pPr>
+        <w:spacing w:after="80" w:before="80"/>
+      </w:pPr>
+      <w:r>
+        <w:rPr>
+          <w:i/>
+          <w:iCs/>
+          <w:color w:val="7F7F7F"/>
+        </w:rPr>
+        <w:t xml:space="preserve">[Use this instead of the block above when the person on the call hasn't worked in the sport. Same structure, without the LinkedIn line.]</w:t>
+      </w:r>
+    </w:p>
+    <w:p>
+      <w:pPr>
+        <w:pBdr>
+          <w:left w:val="single" w:color="2E74B5" w:sz="18" w:space="12"/>
+        </w:pBdr>
+        <w:spacing w:after="60" w:before="60"/>
+        <w:ind w:left="420"/>
+      </w:pPr>
+      <w:r>
+        <w:rPr>
+          <w:color w:val="1F3864"/>
+        </w:rPr>
+        <w:t xml:space="preserve">"Hi [Name], hope all's well. Thanks for making the time.</w:t>
+      </w:r>
+    </w:p>
+    <w:p>
+      <w:pPr>
+        <w:pBdr>
+          <w:left w:val="single" w:color="2E74B5" w:sz="18" w:space="12"/>
+        </w:pBdr>
+        <w:spacing w:after="60" w:before="60"/>
+        <w:ind w:left="420"/>
+      </w:pPr>
+      <w:r>
+        <w:rPr>
+          <w:color w:val="1F3864"/>
+        </w:rPr>
+        <w:t xml:space="preserve">The reason for the call is simple. What Vast is building is one of the most exciting things happening in engineering right now, and from the desk research we've done, a Formula 1 conversation felt at least worth having.</w:t>
+      </w:r>
+    </w:p>
+    <w:p>
+      <w:pPr>
+        <w:pBdr>
+          <w:left w:val="single" w:color="2E74B5" w:sz="18" w:space="12"/>
+        </w:pBdr>
+        <w:spacing w:after="60" w:before="60"/>
+        <w:ind w:left="420"/>
+      </w:pPr>
+      <w:r>
+        <w:rPr>
+          <w:color w:val="1F3864"/>
+        </w:rPr>
+        <w:t xml:space="preserve">The goal today isn't for me to tell you why F1 is a good fit. It's to figure out, together, whether there's an actual fit between what Vast does and what Formula 1 offers as a platform. We learn about you, you ask us anything, and we see where Vast could fit.</w:t>
+      </w:r>
+    </w:p>
+    <w:p>
+      <w:pPr>
+        <w:pBdr>
+          <w:left w:val="single" w:color="2E74B5" w:sz="18" w:space="12"/>
+        </w:pBdr>
+        <w:spacing w:after="60" w:before="60"/>
+        <w:ind w:left="420"/>
+      </w:pPr>
+      <w:r>
+        <w:rPr>
+          <w:color w:val="1F3864"/>
+        </w:rPr>
+        <w:t xml:space="preserve">That's it from me. The three of us, I've got Bjorn and George with me, drive brand partnerships in this sport, bringing the world of motorsport and brands together. Bjorn, George, quick hello?"</w:t>
+      </w:r>
+    </w:p>
+    <w:p>
+      <w:pPr>
+        <w:spacing w:after="80" w:before="80"/>
+      </w:pPr>
+      <w:r>
+        <w:rPr>
+          <w:i/>
+          <w:iCs/>
+          <w:color w:val="7F7F7F"/>
+        </w:rPr>
+        <w:t xml:space="preserve">[If you use this version, also use the "New to F1" block at the start of Part 4; the main script skips the F1 basics because it assumes an insider.]</w:t>
+      </w:r>
+    </w:p>
+    <w:p>
+      <w:pPr>
         <w:pBdr>
           <w:bottom w:val="single" w:color="BFBFBF" w:sz="6" w:space="1"/>
         </w:pBdr>
@@ -1418,6 +1516,34 @@
           <w:color w:val="7F7F7F"/>
         </w:rPr>
         <w:t xml:space="preserve">[No F1 education here; they know the sport. Go straight to the doors, then the fit, then the sketches.]</w:t>
+      </w:r>
+    </w:p>
+    <w:p>
+      <w:pPr>
+        <w:spacing w:after="80" w:before="80"/>
+      </w:pPr>
+      <w:r>
+        <w:rPr>
+          <w:i/>
+          <w:iCs/>
+          <w:color w:val="7F7F7F"/>
+        </w:rPr>
+        <w:t xml:space="preserve">[New to F1 (only with the alternative opening): give the thirty-second picture first.]</w:t>
+      </w:r>
+    </w:p>
+    <w:p>
+      <w:pPr>
+        <w:pBdr>
+          <w:left w:val="single" w:color="2E74B5" w:sz="18" w:space="12"/>
+        </w:pBdr>
+        <w:spacing w:after="60" w:before="60"/>
+        <w:ind w:left="420"/>
+      </w:pPr>
+      <w:r>
+        <w:rPr>
+          <w:color w:val="1F3864"/>
+        </w:rPr>
+        <w:t xml:space="preserve">"Quick picture of how the sport is set up, because it explains the options. Formula 1 itself, the series, is owned by Liberty Media, an American media company: the calendar, the broadcasts, the races. The FIA writes the rules. And then there are eleven teams, including two American ones, Haas and Cadillac, each an independent business with its own partners. Around 24 race weekends a year, a total TV audience of 1.8 billion last season, and in the Paddock Club two thirds of the guests are senior executives."</w:t>
       </w:r>
     </w:p>
     <w:p>

</xml_diff>